<commit_message>
docs(fase1) subida entregables individuales de Nicolas Barraza
</commit_message>
<xml_diff>
--- a/Fase 1/Nicolas_Barraza_1.2_APT122_DiarioReflexionFase1.docx
+++ b/Fase 1/Nicolas_Barraza_1.2_APT122_DiarioReflexionFase1.docx
@@ -750,8 +750,6 @@
         <w:spacing w:after="0" w:line="360" w:lineRule="auto"/>
         <w:jc w:val="both"/>
       </w:pPr>
-      <w:bookmarkStart w:id="0" w:name="_GoBack"/>
-      <w:bookmarkEnd w:id="0"/>
     </w:p>
     <w:p>
       <w:pPr>
@@ -1205,8 +1203,16 @@
               <w:rPr>
                 <w:sz w:val="20"/>
               </w:rPr>
-              <w:t>. Para evitar utilizar información confidencial, el prototipo podría trabajar con datos simulados o conjuntos de datos autorizados. La solución serviría como apoyo a la toma de decisiones y no reemplazaría el criterio del especialista.</w:t>
+              <w:t>. Para evitar utilizar información confidencial, el prototipo podría trabajar con datos simulados o conjuntos de datos autorizados. La solución serviría como apoyo a la toma de decisiones y no reemplazar</w:t>
             </w:r>
+            <w:r>
+              <w:rPr>
+                <w:sz w:val="20"/>
+              </w:rPr>
+              <w:t>ía el criterio del especialista</w:t>
+            </w:r>
+            <w:bookmarkStart w:id="0" w:name="_GoBack"/>
+            <w:bookmarkEnd w:id="0"/>
           </w:p>
         </w:tc>
       </w:tr>
@@ -1381,7 +1387,7 @@
                                     <w:color w:val="8C8C8C" w:themeColor="background1" w:themeShade="8C"/>
                                     <w:lang w:val="es-ES"/>
                                   </w:rPr>
-                                  <w:t>1</w:t>
+                                  <w:t>2</w:t>
                                 </w:r>
                                 <w:r>
                                   <w:rPr>
@@ -1519,7 +1525,7 @@
                               <w:color w:val="8C8C8C" w:themeColor="background1" w:themeShade="8C"/>
                               <w:lang w:val="es-ES"/>
                             </w:rPr>
-                            <w:t>1</w:t>
+                            <w:t>2</w:t>
                           </w:r>
                           <w:r>
                             <w:rPr>
@@ -8447,6 +8453,21 @@
 </file>
 
 <file path=customXml/item1.xml><?xml version="1.0" encoding="utf-8"?>
+<?mso-contentType ?>
+<FormTemplates xmlns="http://schemas.microsoft.com/sharepoint/v3/contenttype/forms">
+  <Display>DocumentLibraryForm</Display>
+  <Edit>DocumentLibraryForm</Edit>
+  <New>DocumentLibraryForm</New>
+</FormTemplates>
+</file>
+
+<file path=customXml/item2.xml><?xml version="1.0" encoding="utf-8"?>
+<p:properties xmlns:p="http://schemas.microsoft.com/office/2006/metadata/properties" xmlns:xsi="http://www.w3.org/2001/XMLSchema-instance" xmlns:pc="http://schemas.microsoft.com/office/infopath/2007/PartnerControls">
+  <documentManagement/>
+</p:properties>
+</file>
+
+<file path=customXml/item3.xml><?xml version="1.0" encoding="utf-8"?>
 <ct:contentTypeSchema xmlns:ct="http://schemas.microsoft.com/office/2006/metadata/contentType" xmlns:ma="http://schemas.microsoft.com/office/2006/metadata/properties/metaAttributes" ct:_="" ma:_="" ma:contentTypeName="Documento" ma:contentTypeID="0x010100E96778489EE7714D8BD12CC105EB918B" ma:contentTypeVersion="2" ma:contentTypeDescription="Crear nuevo documento." ma:contentTypeScope="" ma:versionID="416c5c7ae9b5d54d83875cd3c65194e3">
   <xsd:schema xmlns:xsd="http://www.w3.org/2001/XMLSchema" xmlns:xs="http://www.w3.org/2001/XMLSchema" xmlns:p="http://schemas.microsoft.com/office/2006/metadata/properties" xmlns:ns2="126e8a1c-9ea9-435a-ac89-d06c80d62e30" targetNamespace="http://schemas.microsoft.com/office/2006/metadata/properties" ma:root="true" ma:fieldsID="70a237c842677bd850644f8595079f5e" ns2:_="">
     <xsd:import namespace="126e8a1c-9ea9-435a-ac89-d06c80d62e30"/>
@@ -8578,26 +8599,28 @@
 </ct:contentTypeSchema>
 </file>
 
-<file path=customXml/item2.xml><?xml version="1.0" encoding="utf-8"?>
-<p:properties xmlns:p="http://schemas.microsoft.com/office/2006/metadata/properties" xmlns:xsi="http://www.w3.org/2001/XMLSchema-instance" xmlns:pc="http://schemas.microsoft.com/office/infopath/2007/PartnerControls">
-  <documentManagement/>
-</p:properties>
-</file>
-
-<file path=customXml/item3.xml><?xml version="1.0" encoding="utf-8"?>
-<?mso-contentType ?>
-<FormTemplates xmlns="http://schemas.microsoft.com/sharepoint/v3/contenttype/forms">
-  <Display>DocumentLibraryForm</Display>
-  <Edit>DocumentLibraryForm</Edit>
-  <New>DocumentLibraryForm</New>
-</FormTemplates>
-</file>
-
 <file path=customXml/item4.xml><?xml version="1.0" encoding="utf-8"?>
 <b:Sources xmlns:b="http://schemas.openxmlformats.org/officeDocument/2006/bibliography" xmlns="http://schemas.openxmlformats.org/officeDocument/2006/bibliography" SelectedStyle="\APASixthEditionOfficeOnline.xsl" StyleName="APA" Version="6"/>
 </file>
 
 <file path=customXml/itemProps1.xml><?xml version="1.0" encoding="utf-8"?>
+<ds:datastoreItem xmlns:ds="http://schemas.openxmlformats.org/officeDocument/2006/customXml" ds:itemID="{DABAA964-10BA-4DBC-ABF2-CDEAC0FAF7AA}">
+  <ds:schemaRefs>
+    <ds:schemaRef ds:uri="http://schemas.microsoft.com/sharepoint/v3/contenttype/forms"/>
+  </ds:schemaRefs>
+</ds:datastoreItem>
+</file>
+
+<file path=customXml/itemProps2.xml><?xml version="1.0" encoding="utf-8"?>
+<ds:datastoreItem xmlns:ds="http://schemas.openxmlformats.org/officeDocument/2006/customXml" ds:itemID="{5F1783E3-BA1C-4CA3-8E32-C9B378BBED03}">
+  <ds:schemaRefs>
+    <ds:schemaRef ds:uri="http://schemas.microsoft.com/office/2006/metadata/properties"/>
+    <ds:schemaRef ds:uri="http://schemas.microsoft.com/office/infopath/2007/PartnerControls"/>
+  </ds:schemaRefs>
+</ds:datastoreItem>
+</file>
+
+<file path=customXml/itemProps3.xml><?xml version="1.0" encoding="utf-8"?>
 <ds:datastoreItem xmlns:ds="http://schemas.openxmlformats.org/officeDocument/2006/customXml" ds:itemID="{90673534-9590-47F8-B0D6-46AB217CB3AD}">
   <ds:schemaRefs>
     <ds:schemaRef ds:uri="http://schemas.microsoft.com/office/2006/metadata/contentType"/>
@@ -8615,25 +8638,8 @@
 </ds:datastoreItem>
 </file>
 
-<file path=customXml/itemProps2.xml><?xml version="1.0" encoding="utf-8"?>
-<ds:datastoreItem xmlns:ds="http://schemas.openxmlformats.org/officeDocument/2006/customXml" ds:itemID="{5F1783E3-BA1C-4CA3-8E32-C9B378BBED03}">
-  <ds:schemaRefs>
-    <ds:schemaRef ds:uri="http://schemas.microsoft.com/office/2006/metadata/properties"/>
-    <ds:schemaRef ds:uri="http://schemas.microsoft.com/office/infopath/2007/PartnerControls"/>
-  </ds:schemaRefs>
-</ds:datastoreItem>
-</file>
-
-<file path=customXml/itemProps3.xml><?xml version="1.0" encoding="utf-8"?>
-<ds:datastoreItem xmlns:ds="http://schemas.openxmlformats.org/officeDocument/2006/customXml" ds:itemID="{DABAA964-10BA-4DBC-ABF2-CDEAC0FAF7AA}">
-  <ds:schemaRefs>
-    <ds:schemaRef ds:uri="http://schemas.microsoft.com/sharepoint/v3/contenttype/forms"/>
-  </ds:schemaRefs>
-</ds:datastoreItem>
-</file>
-
 <file path=customXml/itemProps4.xml><?xml version="1.0" encoding="utf-8"?>
-<ds:datastoreItem xmlns:ds="http://schemas.openxmlformats.org/officeDocument/2006/customXml" ds:itemID="{9AEA07F3-7379-4A15-8B6E-08D8BE77E1C3}">
+<ds:datastoreItem xmlns:ds="http://schemas.openxmlformats.org/officeDocument/2006/customXml" ds:itemID="{D664E277-51DA-4DE7-B649-CBCF353CD6B5}">
   <ds:schemaRefs>
     <ds:schemaRef ds:uri="http://schemas.openxmlformats.org/officeDocument/2006/bibliography"/>
   </ds:schemaRefs>

</xml_diff>